<commit_message>
Nome oficial da empresa: Timorgiara Neto, Unipessoal Lda
Era «Timorgiana, Lda» em todo o lado: os sete documentos jurídicos, o aviso
de privacidade (app e página pública, nas três línguas), a política de
segurança, a ficha da Play Store, a lista do piloto e o plano. Word, páginas
públicas e plano gerados de novo. A versão dos termos não sobe: o sentido
não muda, só a identificação de quem trata os dados.

Co-Authored-By: Claude Opus 5.5 <noreply@anthropic.com>
</commit_message>
<xml_diff>
--- a/juridico/1 - Regulamento de Admissao de Motoristas.docx
+++ b/juridico/1 - Regulamento de Admissao de Motoristas.docx
@@ -33,7 +33,7 @@
           <w:sz w:val="19"/>
           <w:szCs w:val="19"/>
         </w:rPr>
-        <w:t xml:space="preserve">Timorgiana, Lda  ·  Bidau Toko-Baru, Cristo Rei, Díli, Timor-Leste  ·  +670 74192857  ·  +670 75684566  ·  Versão de 14 de Setembro de 2026</w:t>
+        <w:t xml:space="preserve">Timorgiara Neto, Unipessoal Lda  ·  Bidau Toko-Baru, Cristo Rei, Díli, Timor-Leste  ·  +670 74192857  ·  +670 75684566  ·  Versão de 14 de Setembro de 2026</w:t>
       </w:r>
     </w:p>
     <w:p>
@@ -68,7 +68,7 @@
           <w:sz w:val="21"/>
           <w:szCs w:val="21"/>
         </w:rPr>
-        <w:t xml:space="preserve">O presente Regulamento fixa os requisitos, os documentos e o procedimento de admissão de motoristas à plataforma tecnológica TimorgianaRide, explorada pela Timorgiana, Lda.</w:t>
+        <w:t xml:space="preserve">O presente Regulamento fixa os requisitos, os documentos e o procedimento de admissão de motoristas à plataforma tecnológica TimorgianaRide, explorada pela Timorgiara Neto, Unipessoal Lda.</w:t>
       </w:r>
     </w:p>
     <w:p>
@@ -397,7 +397,7 @@
           <w:sz w:val="21"/>
           <w:szCs w:val="21"/>
         </w:rPr>
-        <w:t xml:space="preserve">A Timorgiana, Lda não exige a apresentação da apólice, não a verifica e não é seguradora.</w:t>
+        <w:t xml:space="preserve">A Timorgiara Neto, Unipessoal Lda não exige a apresentação da apólice, não a verifica e não é seguradora.</w:t>
       </w:r>
       <w:r>
         <w:rPr>
@@ -1356,7 +1356,7 @@
           <w:sz w:val="21"/>
           <w:szCs w:val="21"/>
         </w:rPr>
-        <w:t xml:space="preserve">A candidatura é apreciada pela Timorgiana, Lda, que verifica a legibilidade dos documentos, a correspondência entre o titular e a fotografia, a coerência entre a matrícula declarada e a documentação apresentada, e se as categorias constantes do verso da carta de condução permitem conduzir o veículo declarado.</w:t>
+        <w:t xml:space="preserve">A candidatura é apreciada pela Timorgiara Neto, Unipessoal Lda, que verifica a legibilidade dos documentos, a correspondência entre o titular e a fotografia, a coerência entre a matrícula declarada e a documentação apresentada, e se as categorias constantes do verso da carta de condução permitem conduzir o veículo declarado.</w:t>
       </w:r>
     </w:p>
     <w:p>
@@ -1554,7 +1554,7 @@
           <w:sz w:val="21"/>
           <w:szCs w:val="21"/>
         </w:rPr>
-        <w:t xml:space="preserve"> com a submissão do documento regularizado, sem necessidade de qualquer ato da Timorgiana, Lda. Um motorista que renove a inspeção de manhã pode trabalhar nessa tarde.</w:t>
+        <w:t xml:space="preserve"> com a submissão do documento regularizado, sem necessidade de qualquer ato da Timorgiara Neto, Unipessoal Lda. Um motorista que renove a inspeção de manhã pode trabalhar nessa tarde.</w:t>
       </w:r>
     </w:p>
     <w:p>
@@ -1982,7 +1982,7 @@
           <w:sz w:val="21"/>
           <w:szCs w:val="21"/>
         </w:rPr>
-        <w:t xml:space="preserve">O documento substituído entra imediatamente em vigor, para que o motorista não fique impedido de trabalhar, mas fica assinalado como pendente de confirmação até ser verificado pela Timorgiana, Lda.</w:t>
+        <w:t xml:space="preserve">O documento substituído entra imediatamente em vigor, para que o motorista não fique impedido de trabalhar, mas fica assinalado como pendente de confirmação até ser verificado pela Timorgiara Neto, Unipessoal Lda.</w:t>
       </w:r>
     </w:p>
     <w:p>
@@ -2159,7 +2159,7 @@
           <w:sz w:val="21"/>
           <w:szCs w:val="21"/>
         </w:rPr>
-        <w:t xml:space="preserve">A Timorgiana, Lda pode alterá-lo, avisando os motoristas na aplicação com antecedência razoável.</w:t>
+        <w:t xml:space="preserve">A Timorgiara Neto, Unipessoal Lda pode alterá-lo, avisando os motoristas na aplicação com antecedência razoável.</w:t>
       </w:r>
     </w:p>
     <w:sectPr>
@@ -2322,7 +2322,7 @@
         <w:sz w:val="16"/>
         <w:szCs w:val="16"/>
       </w:rPr>
-      <w:t xml:space="preserve">TimorgianaRide  ·  Timorgiana, Lda</w:t>
+      <w:t xml:space="preserve">TimorgianaRide  ·  Timorgiara Neto, Unipessoal Lda</w:t>
     </w:r>
   </w:p>
 </w:hdr>

</xml_diff>

<commit_message>
Nome oficial com a vírgula do registo: Timorgiara Neto, Unipessoal, Lda
Co-Authored-By: Claude Opus 5.5 <noreply@anthropic.com>
</commit_message>
<xml_diff>
--- a/juridico/1 - Regulamento de Admissao de Motoristas.docx
+++ b/juridico/1 - Regulamento de Admissao de Motoristas.docx
@@ -33,7 +33,7 @@
           <w:sz w:val="19"/>
           <w:szCs w:val="19"/>
         </w:rPr>
-        <w:t xml:space="preserve">Timorgiara Neto, Unipessoal Lda  ·  Bidau Toko-Baru, Cristo Rei, Díli, Timor-Leste  ·  +670 74192857  ·  +670 75684566  ·  Versão de 14 de Setembro de 2026</w:t>
+        <w:t xml:space="preserve">Timorgiara Neto, Unipessoal, Lda  ·  Bidau Toko-Baru, Cristo Rei, Díli, Timor-Leste  ·  +670 74192857  ·  +670 75684566  ·  Versão de 14 de Setembro de 2026</w:t>
       </w:r>
     </w:p>
     <w:p>
@@ -68,7 +68,7 @@
           <w:sz w:val="21"/>
           <w:szCs w:val="21"/>
         </w:rPr>
-        <w:t xml:space="preserve">O presente Regulamento fixa os requisitos, os documentos e o procedimento de admissão de motoristas à plataforma tecnológica TimorgianaRide, explorada pela Timorgiara Neto, Unipessoal Lda.</w:t>
+        <w:t xml:space="preserve">O presente Regulamento fixa os requisitos, os documentos e o procedimento de admissão de motoristas à plataforma tecnológica TimorgianaRide, explorada pela Timorgiara Neto, Unipessoal, Lda.</w:t>
       </w:r>
     </w:p>
     <w:p>
@@ -397,7 +397,7 @@
           <w:sz w:val="21"/>
           <w:szCs w:val="21"/>
         </w:rPr>
-        <w:t xml:space="preserve">A Timorgiara Neto, Unipessoal Lda não exige a apresentação da apólice, não a verifica e não é seguradora.</w:t>
+        <w:t xml:space="preserve">A Timorgiara Neto, Unipessoal, Lda não exige a apresentação da apólice, não a verifica e não é seguradora.</w:t>
       </w:r>
       <w:r>
         <w:rPr>
@@ -1356,7 +1356,7 @@
           <w:sz w:val="21"/>
           <w:szCs w:val="21"/>
         </w:rPr>
-        <w:t xml:space="preserve">A candidatura é apreciada pela Timorgiara Neto, Unipessoal Lda, que verifica a legibilidade dos documentos, a correspondência entre o titular e a fotografia, a coerência entre a matrícula declarada e a documentação apresentada, e se as categorias constantes do verso da carta de condução permitem conduzir o veículo declarado.</w:t>
+        <w:t xml:space="preserve">A candidatura é apreciada pela Timorgiara Neto, Unipessoal, Lda, que verifica a legibilidade dos documentos, a correspondência entre o titular e a fotografia, a coerência entre a matrícula declarada e a documentação apresentada, e se as categorias constantes do verso da carta de condução permitem conduzir o veículo declarado.</w:t>
       </w:r>
     </w:p>
     <w:p>
@@ -1554,7 +1554,7 @@
           <w:sz w:val="21"/>
           <w:szCs w:val="21"/>
         </w:rPr>
-        <w:t xml:space="preserve"> com a submissão do documento regularizado, sem necessidade de qualquer ato da Timorgiara Neto, Unipessoal Lda. Um motorista que renove a inspeção de manhã pode trabalhar nessa tarde.</w:t>
+        <w:t xml:space="preserve"> com a submissão do documento regularizado, sem necessidade de qualquer ato da Timorgiara Neto, Unipessoal, Lda. Um motorista que renove a inspeção de manhã pode trabalhar nessa tarde.</w:t>
       </w:r>
     </w:p>
     <w:p>
@@ -1982,7 +1982,7 @@
           <w:sz w:val="21"/>
           <w:szCs w:val="21"/>
         </w:rPr>
-        <w:t xml:space="preserve">O documento substituído entra imediatamente em vigor, para que o motorista não fique impedido de trabalhar, mas fica assinalado como pendente de confirmação até ser verificado pela Timorgiara Neto, Unipessoal Lda.</w:t>
+        <w:t xml:space="preserve">O documento substituído entra imediatamente em vigor, para que o motorista não fique impedido de trabalhar, mas fica assinalado como pendente de confirmação até ser verificado pela Timorgiara Neto, Unipessoal, Lda.</w:t>
       </w:r>
     </w:p>
     <w:p>
@@ -2159,7 +2159,7 @@
           <w:sz w:val="21"/>
           <w:szCs w:val="21"/>
         </w:rPr>
-        <w:t xml:space="preserve">A Timorgiara Neto, Unipessoal Lda pode alterá-lo, avisando os motoristas na aplicação com antecedência razoável.</w:t>
+        <w:t xml:space="preserve">A Timorgiara Neto, Unipessoal, Lda pode alterá-lo, avisando os motoristas na aplicação com antecedência razoável.</w:t>
       </w:r>
     </w:p>
     <w:sectPr>
@@ -2322,7 +2322,7 @@
         <w:sz w:val="16"/>
         <w:szCs w:val="16"/>
       </w:rPr>
-      <w:t xml:space="preserve">TimorgianaRide  ·  Timorgiara Neto, Unipessoal Lda</w:t>
+      <w:t xml:space="preserve">TimorgianaRide  ·  Timorgiara Neto, Unipessoal, Lda</w:t>
     </w:r>
   </w:p>
 </w:hdr>

</xml_diff>

<commit_message>
A app passa a chamar-se HAKAT
Nome e logótipo novos, escolha do Simão (07/10/2026). «TimorgianaRide»
passa a «HAKAT» em todo o texto que se lê: app (pt/tet/en), mensagens e
emails do servidor, termos, privacidade e segurança, painel, documentos
jurídicos, ficha da Play Store e plano.

O logótipo vem de desenho/imagens/HAKAT (fora do git), processado por
scripts/gerar-logotipos.py: marca (o H com a estrada) e completo (com a
palavra), normais e claros para os ecrãs teal; ícone da app = só o H
sobre branco (decisão dele); arranque e ícone adaptativo sobre branco.

Ficam iguais, de propósito: o identificador da app (tl.timorgiana.ride),
o endereço do servidor e o `service: 'TimorgianaRide'` do /api/health,
que as apps instaladas procuram para reconhecer o servidor.

Co-Authored-By: Claude Opus 5.5 <noreply@anthropic.com>
</commit_message>
<xml_diff>
--- a/juridico/1 - Regulamento de Admissao de Motoristas.docx
+++ b/juridico/1 - Regulamento de Admissao de Motoristas.docx
@@ -68,7 +68,7 @@
           <w:sz w:val="21"/>
           <w:szCs w:val="21"/>
         </w:rPr>
-        <w:t xml:space="preserve">O presente Regulamento fixa os requisitos, os documentos e o procedimento de admissão de motoristas à plataforma tecnológica TimorgianaRide, explorada pela Timorgiara Neto, Unipessoal, Lda.</w:t>
+        <w:t xml:space="preserve">O presente Regulamento fixa os requisitos, os documentos e o procedimento de admissão de motoristas à plataforma tecnológica HAKAT, explorada pela Timorgiara Neto, Unipessoal, Lda.</w:t>
       </w:r>
     </w:p>
     <w:p>
@@ -2322,7 +2322,7 @@
         <w:sz w:val="16"/>
         <w:szCs w:val="16"/>
       </w:rPr>
-      <w:t xml:space="preserve">TimorgianaRide  ·  Timorgiara Neto, Unipessoal, Lda</w:t>
+      <w:t xml:space="preserve">HAKAT  ·  Timorgiara Neto, Unipessoal, Lda</w:t>
     </w:r>
   </w:p>
 </w:hdr>

</xml_diff>

<commit_message>
Nome e sede da empresa como no registo
Timorgiara Neto, Unipessoal, Lda., com sede no Zero III, Fatuhada,
Dom Aleixo, Díli, Timor-Leste (dito pelo Simão a 07/10/2026). A morada
antiga (Bidau Toko-Baru, Cristo Rei) sai dos documentos jurídicos, do
aviso de privacidade (pt/tet/en) e da página de segurança.

Co-Authored-By: Claude Opus 5.5 <noreply@anthropic.com>
</commit_message>
<xml_diff>
--- a/juridico/1 - Regulamento de Admissao de Motoristas.docx
+++ b/juridico/1 - Regulamento de Admissao de Motoristas.docx
@@ -33,7 +33,7 @@
           <w:sz w:val="19"/>
           <w:szCs w:val="19"/>
         </w:rPr>
-        <w:t xml:space="preserve">Timorgiara Neto, Unipessoal, Lda  ·  Bidau Toko-Baru, Cristo Rei, Díli, Timor-Leste  ·  +670 74192857  ·  +670 75684566  ·  Versão de 14 de Setembro de 2026</w:t>
+        <w:t xml:space="preserve">Timorgiara Neto, Unipessoal, Lda.  ·  Zero III, Fatuhada, Dom Aleixo, Díli, Timor-Leste  ·  +670 74192857  ·  +670 75684566  ·  Versão de 14 de Setembro de 2026</w:t>
       </w:r>
     </w:p>
     <w:p>
@@ -397,7 +397,7 @@
           <w:sz w:val="21"/>
           <w:szCs w:val="21"/>
         </w:rPr>
-        <w:t xml:space="preserve">A Timorgiara Neto, Unipessoal, Lda não exige a apresentação da apólice, não a verifica e não é seguradora.</w:t>
+        <w:t xml:space="preserve">A Timorgiara Neto, Unipessoal, Lda. não exige a apresentação da apólice, não a verifica e não é seguradora.</w:t>
       </w:r>
       <w:r>
         <w:rPr>
@@ -1356,7 +1356,7 @@
           <w:sz w:val="21"/>
           <w:szCs w:val="21"/>
         </w:rPr>
-        <w:t xml:space="preserve">A candidatura é apreciada pela Timorgiara Neto, Unipessoal, Lda, que verifica a legibilidade dos documentos, a correspondência entre o titular e a fotografia, a coerência entre a matrícula declarada e a documentação apresentada, e se as categorias constantes do verso da carta de condução permitem conduzir o veículo declarado.</w:t>
+        <w:t xml:space="preserve">A candidatura é apreciada pela Timorgiara Neto, Unipessoal, Lda., que verifica a legibilidade dos documentos, a correspondência entre o titular e a fotografia, a coerência entre a matrícula declarada e a documentação apresentada, e se as categorias constantes do verso da carta de condução permitem conduzir o veículo declarado.</w:t>
       </w:r>
     </w:p>
     <w:p>
@@ -2159,7 +2159,7 @@
           <w:sz w:val="21"/>
           <w:szCs w:val="21"/>
         </w:rPr>
-        <w:t xml:space="preserve">A Timorgiara Neto, Unipessoal, Lda pode alterá-lo, avisando os motoristas na aplicação com antecedência razoável.</w:t>
+        <w:t xml:space="preserve">A Timorgiara Neto, Unipessoal, Lda. pode alterá-lo, avisando os motoristas na aplicação com antecedência razoável.</w:t>
       </w:r>
     </w:p>
     <w:sectPr>
@@ -2322,7 +2322,7 @@
         <w:sz w:val="16"/>
         <w:szCs w:val="16"/>
       </w:rPr>
-      <w:t xml:space="preserve">HAKAT  ·  Timorgiara Neto, Unipessoal, Lda</w:t>
+      <w:t xml:space="preserve">HAKAT  ·  Timorgiara Neto, Unipessoal, Lda.</w:t>
     </w:r>
   </w:p>
 </w:hdr>

</xml_diff>

<commit_message>
Requisitos do motorista: folha que sobe do fundo, e registo criminal obrigatório
«Ver requisitos» abre uma folha creme (maqueta do Simão, 09/10/2026) com os
6 documentos, as condições de adesão e a informação importante. Decidido
com ele: o certificado de registo criminal passa a documento obrigatório
de um REGISTO NOVO (como as fotografias do veículo — quem já está aprovado
não fica parado; o painel aponta-o); a licença de transporte aparece
«quando legalmente exigida»; o seguro fica como nos regulamentos
(obrigatório por lei, do motorista, a HAKAT não o verifica).
Regulamento de Admissão (art. 4.º, documento 7) e lista de verificação
atualizados e gerados de novo.

Co-Authored-By: Claude Opus 5.5 <noreply@anthropic.com>
</commit_message>
<xml_diff>
--- a/juridico/1 - Regulamento de Admissao de Motoristas.docx
+++ b/juridico/1 - Regulamento de Admissao de Motoristas.docx
@@ -461,7 +461,7 @@
           <w:sz w:val="21"/>
           <w:szCs w:val="21"/>
         </w:rPr>
-        <w:t xml:space="preserve">A candidatura só é apreciada quando estiverem submetidos os seis documentos seguintes:</w:t>
+        <w:t xml:space="preserve">A candidatura só é apreciada quando estiverem submetidos os sete documentos seguintes:</w:t>
       </w:r>
     </w:p>
     <w:tbl>
@@ -1041,7 +1041,102 @@
           </w:p>
         </w:tc>
       </w:tr>
+      <w:tr>
+        <w:tc>
+          <w:tcPr>
+            <w:tcW w:type="dxa" w:w="2500"/>
+            <w:tcMar>
+              <w:top w:type="dxa" w:w="90"/>
+              <w:left w:type="dxa" w:w="120"/>
+              <w:bottom w:type="dxa" w:w="90"/>
+              <w:right w:type="dxa" w:w="120"/>
+            </w:tcMar>
+          </w:tcPr>
+          <w:p>
+            <w:pPr>
+              <w:spacing w:after="0" w:line="264"/>
+            </w:pPr>
+            <w:r>
+              <w:rPr>
+                <w:rFonts w:ascii="Calibri" w:cs="Calibri" w:eastAsia="Calibri" w:hAnsi="Calibri"/>
+                <w:color w:val="14201D"/>
+                <w:sz w:val="19"/>
+                <w:szCs w:val="19"/>
+              </w:rPr>
+              <w:t xml:space="preserve">7. Certificado de registo criminal</w:t>
+            </w:r>
+          </w:p>
+        </w:tc>
+        <w:tc>
+          <w:tcPr>
+            <w:tcW w:type="dxa" w:w="4100"/>
+            <w:tcMar>
+              <w:top w:type="dxa" w:w="90"/>
+              <w:left w:type="dxa" w:w="120"/>
+              <w:bottom w:type="dxa" w:w="90"/>
+              <w:right w:type="dxa" w:w="120"/>
+            </w:tcMar>
+          </w:tcPr>
+          <w:p>
+            <w:pPr>
+              <w:spacing w:after="0" w:line="264"/>
+            </w:pPr>
+            <w:r>
+              <w:rPr>
+                <w:rFonts w:ascii="Calibri" w:cs="Calibri" w:eastAsia="Calibri" w:hAnsi="Calibri"/>
+                <w:color w:val="14201D"/>
+                <w:sz w:val="19"/>
+                <w:szCs w:val="19"/>
+              </w:rPr>
+              <w:t xml:space="preserve">Verificar a idoneidade do candidato para transportar passageiros</w:t>
+            </w:r>
+          </w:p>
+        </w:tc>
+        <w:tc>
+          <w:tcPr>
+            <w:tcW w:type="dxa" w:w="1900"/>
+            <w:tcMar>
+              <w:top w:type="dxa" w:w="90"/>
+              <w:left w:type="dxa" w:w="120"/>
+              <w:bottom w:type="dxa" w:w="90"/>
+              <w:right w:type="dxa" w:w="120"/>
+            </w:tcMar>
+          </w:tcPr>
+          <w:p>
+            <w:pPr>
+              <w:spacing w:after="0" w:line="264"/>
+            </w:pPr>
+            <w:r>
+              <w:rPr>
+                <w:rFonts w:ascii="Calibri" w:cs="Calibri" w:eastAsia="Calibri" w:hAnsi="Calibri"/>
+                <w:color w:val="14201D"/>
+                <w:sz w:val="19"/>
+                <w:szCs w:val="19"/>
+              </w:rPr>
+              <w:t xml:space="preserve">Emitido nos três meses anteriores à candidatura</w:t>
+            </w:r>
+          </w:p>
+        </w:tc>
+      </w:tr>
     </w:tbl>
+    <w:p>
+      <w:pPr>
+        <w:spacing w:after="120" w:line="276"/>
+        <w:jc w:val="both"/>
+      </w:pPr>
+      <w:r>
+        <w:rPr>
+          <w:rFonts w:ascii="Calibri" w:cs="Calibri" w:eastAsia="Calibri" w:hAnsi="Calibri"/>
+          <w:b w:val="false"/>
+          <w:bCs w:val="false"/>
+          <w:i w:val="false"/>
+          <w:iCs w:val="false"/>
+          <w:sz w:val="21"/>
+          <w:szCs w:val="21"/>
+        </w:rPr>
+        <w:t xml:space="preserve">O certificado de registo criminal é apreciado por quem decide a candidatura, nos termos do artigo 8.º. Os motoristas já aprovados à data da entrada em vigor desta exigência mantêm a sua conta ativa e são convidados a apresentá-lo, sem que a sua falta determine a suspensão.</w:t>
+      </w:r>
+    </w:p>
     <w:p>
       <w:pPr>
         <w:pBdr>

</xml_diff>

<commit_message>
Veículo próprio ou de terceiro no registo do motorista; de terceiro exige identificação e autorização do proprietário
App (escolha no registo e no formulário do veículo, documentos só para terceiro,
modelo da declaração para descarregar), servidor (vehicle_proprio, DOCS_TERCEIRO
no registo e em podeTrabalhar, /modelos/declaracao-proprietario), painel
(titularidade e verificação) e regulamentos d1, d2 e d7.

Co-Authored-By: Claude Opus 5.5 <noreply@anthropic.com>
</commit_message>
<xml_diff>
--- a/juridico/1 - Regulamento de Admissao de Motoristas.docx
+++ b/juridico/1 - Regulamento de Admissao de Motoristas.docx
@@ -1135,6 +1135,24 @@
           <w:szCs w:val="21"/>
         </w:rPr>
         <w:t xml:space="preserve">O certificado de registo criminal é apreciado por quem decide a candidatura, nos termos do artigo 8.º. A existência de qualquer condenação nele registada impede a admissão e determina a recusa da candidatura. Os motoristas já aprovados à data da entrada em vigor desta exigência mantêm a sua conta ativa e são convidados a apresentá-lo, sem que a sua falta determine a suspensão.</w:t>
+      </w:r>
+    </w:p>
+    <w:p>
+      <w:pPr>
+        <w:spacing w:after="120" w:line="276"/>
+        <w:jc w:val="both"/>
+      </w:pPr>
+      <w:r>
+        <w:rPr>
+          <w:rFonts w:ascii="Calibri" w:cs="Calibri" w:eastAsia="Calibri" w:hAnsi="Calibri"/>
+          <w:b w:val="false"/>
+          <w:bCs w:val="false"/>
+          <w:i w:val="false"/>
+          <w:iCs w:val="false"/>
+          <w:sz w:val="21"/>
+          <w:szCs w:val="21"/>
+        </w:rPr>
+        <w:t xml:space="preserve">Quando o veículo registado não pertença ao candidato, este declara-o no registo e apresenta ainda: (a) o documento de identificação do proprietário do veículo; e (b) a declaração de autorização assinada pelo proprietário, conforme o modelo disponibilizado pela Timorgiara Neto, Unipessoal, Lda., que identifique o proprietário, o motorista e o veículo autorizado. Sem estes documentos o registo não fica completo nem pode ser aprovado, e o motorista não pode realizar viagens com esse veículo.</w:t>
       </w:r>
     </w:p>
     <w:p>

</xml_diff>

<commit_message>
Cartão do seguro: opcional por agora, com validade, dá ao passageiro o selo «Seguro ✓»; obrigatório numa data a fixar
Servidor (tipo 'seguro', SEGURO_OBRIGATORIO_DESDE=null, selo d_seguro na viagem,
avisos de validade), app (documento opcional, selo, requisitos), painel e
regulamentos d1/d2/d7 e Termos do Motorista (versão 2026-10-10b).

Co-Authored-By: Claude Opus 5.5 <noreply@anthropic.com>
</commit_message>
<xml_diff>
--- a/juridico/1 - Regulamento de Admissao de Motoristas.docx
+++ b/juridico/1 - Regulamento de Admissao de Motoristas.docx
@@ -397,7 +397,7 @@
           <w:sz w:val="21"/>
           <w:szCs w:val="21"/>
         </w:rPr>
-        <w:t xml:space="preserve">A Timorgiara Neto, Unipessoal, Lda. não exige a apresentação da apólice, não a verifica e não é seguradora.</w:t>
+        <w:t xml:space="preserve">A Timorgiara Neto, Unipessoal, Lda. não é seguradora.</w:t>
       </w:r>
       <w:r>
         <w:rPr>
@@ -406,6 +406,42 @@
           <w:szCs w:val="21"/>
         </w:rPr>
         <w:t xml:space="preserve"> A verificação do cumprimento desta obrigação compete às autoridades.</w:t>
+      </w:r>
+    </w:p>
+    <w:p>
+      <w:pPr>
+        <w:spacing w:after="120" w:line="276"/>
+        <w:jc w:val="both"/>
+      </w:pPr>
+      <w:r>
+        <w:rPr>
+          <w:rFonts w:ascii="Calibri" w:cs="Calibri" w:eastAsia="Calibri" w:hAnsi="Calibri"/>
+          <w:b w:val="false"/>
+          <w:bCs w:val="false"/>
+          <w:i w:val="false"/>
+          <w:iCs w:val="false"/>
+          <w:sz w:val="21"/>
+          <w:szCs w:val="21"/>
+        </w:rPr>
+        <w:t xml:space="preserve">O motorista pode apresentar, facultativamente, o cartão do seguro através da aplicação. A apresentação de cartão dentro do prazo de validade dá ao veículo o selo «Seguro ✓», visível ao passageiro. A Timorgiara Neto, Unipessoal, Lda. confere apenas a existência do cartão e a data de validade indicada, para efeito do selo; não verifica o conteúdo, a suficiência nem a vigência da cobertura, que continuam a ser da exclusiva responsabilidade do motorista.</w:t>
+      </w:r>
+    </w:p>
+    <w:p>
+      <w:pPr>
+        <w:spacing w:after="120" w:line="276"/>
+        <w:jc w:val="both"/>
+      </w:pPr>
+      <w:r>
+        <w:rPr>
+          <w:rFonts w:ascii="Calibri" w:cs="Calibri" w:eastAsia="Calibri" w:hAnsi="Calibri"/>
+          <w:b w:val="false"/>
+          <w:bCs w:val="false"/>
+          <w:i w:val="false"/>
+          <w:iCs w:val="false"/>
+          <w:sz w:val="21"/>
+          <w:szCs w:val="21"/>
+        </w:rPr>
+        <w:t xml:space="preserve">A Timorgiara Neto, Unipessoal, Lda. pode tornar obrigatória a apresentação do cartão do seguro, mediante aviso na aplicação com, pelo menos, 30 dias de antecedência.</w:t>
       </w:r>
     </w:p>
     <w:p>

</xml_diff>